<commit_message>
docs(s4): reconcile testing report and retain executed test evidence
</commit_message>
<xml_diff>
--- a/docs/QMSE/SE3090_SE016_Assignment2_Software_Testing_Report_FILLED.docx
+++ b/docs/QMSE/SE3090_SE016_Assignment2_Software_Testing_Report_FILLED.docx
@@ -987,10 +987,11 @@
           <w:rFonts w:ascii="Arial" w:cs="Arial" w:eastAsia="Arial" w:hAnsi="Arial"/>
           <w:b/>
           <w:bCs/>
+          <w:color w:val="000000"/>
           <w:sz w:val="20"/>
           <w:szCs w:val="20"/>
         </w:rPr>
-        <w:t xml:space="preserve">Group:</w:t>
+        <w:t>Group: SE_016     Report date: 8 October 2026</w:t>
       </w:r>
       <w:r>
         <w:rPr>
@@ -998,7 +999,6 @@
           <w:sz w:val="20"/>
           <w:szCs w:val="20"/>
         </w:rPr>
-        <w:t xml:space="preserve"> SE_016     </w:t>
       </w:r>
       <w:r>
         <w:rPr>
@@ -1008,7 +1008,6 @@
           <w:sz w:val="20"/>
           <w:szCs w:val="20"/>
         </w:rPr>
-        <w:t xml:space="preserve">Submission date:</w:t>
       </w:r>
       <w:r>
         <w:rPr>
@@ -1016,7 +1015,6 @@
           <w:sz w:val="20"/>
           <w:szCs w:val="20"/>
         </w:rPr>
-        <w:t xml:space="preserve"> </w:t>
       </w:r>
       <w:r>
         <w:rPr>
@@ -1024,7 +1022,6 @@
           <w:sz w:val="20"/>
           <w:szCs w:val="20"/>
         </w:rPr>
-        <w:t xml:space="preserve">8 October 2026</w:t>
       </w:r>
     </w:p>
     <w:p>
@@ -1059,10 +1056,11 @@
           <w:rFonts w:ascii="Arial" w:cs="Arial" w:eastAsia="Arial" w:hAnsi="Arial"/>
           <w:b/>
           <w:bCs/>
+          <w:color w:val="000000"/>
           <w:sz w:val="20"/>
           <w:szCs w:val="20"/>
         </w:rPr>
-        <w:t xml:space="preserve">Lecturer / lab group:</w:t>
+        <w:t>Lecturer / lab group: ______________________________</w:t>
       </w:r>
       <w:r>
         <w:rPr>
@@ -1070,7 +1068,6 @@
           <w:sz w:val="20"/>
           <w:szCs w:val="20"/>
         </w:rPr>
-        <w:t xml:space="preserve"> </w:t>
       </w:r>
       <w:r>
         <w:rPr>
@@ -1081,876 +1078,8 @@
           <w:sz w:val="20"/>
           <w:szCs w:val="20"/>
         </w:rPr>
-        <w:t xml:space="preserve">[ADD: lecturer in charge and lab/batch group if your cover page needs it]</w:t>
       </w:r>
     </w:p>
-    <w:p>
-      <w:r>
-        <w:br w:type="page"/>
-      </w:r>
-    </w:p>
-    <w:p>
-      <w:pPr>
-        <w:spacing w:after="120"/>
-      </w:pPr>
-      <w:r>
-        <w:rPr>
-          <w:rFonts w:ascii="Arial" w:cs="Arial" w:eastAsia="Arial" w:hAnsi="Arial"/>
-          <w:b/>
-          <w:bCs/>
-          <w:color w:val="C00000"/>
-          <w:sz w:val="28"/>
-          <w:szCs w:val="28"/>
-        </w:rPr>
-        <w:t xml:space="preserve">BEFORE UPLOAD — DELETE THIS PAGE</w:t>
-      </w:r>
-    </w:p>
-    <w:p>
-      <w:pPr>
-        <w:spacing w:after="120" w:line="276"/>
-      </w:pPr>
-      <w:r>
-        <w:rPr>
-          <w:rFonts w:ascii="Arial" w:cs="Arial" w:eastAsia="Arial" w:hAnsi="Arial"/>
-          <w:color w:val="C00000"/>
-          <w:sz w:val="20"/>
-          <w:szCs w:val="20"/>
-        </w:rPr>
-        <w:t xml:space="preserve">Every item still needing your input is written in the document in red inside square brackets. Search for “[” in Word to jump between them. Replace each with your own text in black, then delete this page.</w:t>
-      </w:r>
-    </w:p>
-    <w:tbl>
-      <w:tblPr>
-        <w:tblW w:type="dxa" w:w="9026"/>
-        <w:tblBorders>
-          <w:top w:val="single" w:color="auto" w:sz="4"/>
-          <w:left w:val="single" w:color="auto" w:sz="4"/>
-          <w:bottom w:val="single" w:color="auto" w:sz="4"/>
-          <w:right w:val="single" w:color="auto" w:sz="4"/>
-          <w:insideH w:val="single" w:color="auto" w:sz="4"/>
-          <w:insideV w:val="single" w:color="auto" w:sz="4"/>
-        </w:tblBorders>
-      </w:tblPr>
-      <w:tblGrid>
-        <w:gridCol w:w="451"/>
-        <w:gridCol w:w="2257"/>
-        <w:gridCol w:w="6318"/>
-      </w:tblGrid>
-      <w:tr>
-        <w:trPr>
-          <w:tblHeader/>
-        </w:trPr>
-        <w:tc>
-          <w:tcPr>
-            <w:tcW w:type="dxa" w:w="451"/>
-            <w:tcBorders>
-              <w:top w:val="single" w:color="8C8C8C" w:sz="4"/>
-              <w:left w:val="single" w:color="8C8C8C" w:sz="4"/>
-              <w:bottom w:val="single" w:color="8C8C8C" w:sz="4"/>
-              <w:right w:val="single" w:color="8C8C8C" w:sz="4"/>
-            </w:tcBorders>
-            <w:shd w:fill="1F3864" w:color="auto" w:val="clear"/>
-            <w:tcMar>
-              <w:top w:type="dxa" w:w="50"/>
-              <w:left w:type="dxa" w:w="80"/>
-              <w:bottom w:type="dxa" w:w="50"/>
-              <w:right w:type="dxa" w:w="80"/>
-            </w:tcMar>
-          </w:tcPr>
-          <w:p>
-            <w:pPr>
-              <w:spacing w:after="0"/>
-            </w:pPr>
-            <w:r>
-              <w:rPr>
-                <w:rFonts w:ascii="Arial" w:cs="Arial" w:eastAsia="Arial" w:hAnsi="Arial"/>
-                <w:b/>
-                <w:bCs/>
-                <w:color w:val="FFFFFF"/>
-                <w:sz w:val="17"/>
-                <w:szCs w:val="17"/>
-              </w:rPr>
-              <w:t xml:space="preserve">#</w:t>
-            </w:r>
-          </w:p>
-        </w:tc>
-        <w:tc>
-          <w:tcPr>
-            <w:tcW w:type="dxa" w:w="2257"/>
-            <w:tcBorders>
-              <w:top w:val="single" w:color="8C8C8C" w:sz="4"/>
-              <w:left w:val="single" w:color="8C8C8C" w:sz="4"/>
-              <w:bottom w:val="single" w:color="8C8C8C" w:sz="4"/>
-              <w:right w:val="single" w:color="8C8C8C" w:sz="4"/>
-            </w:tcBorders>
-            <w:shd w:fill="1F3864" w:color="auto" w:val="clear"/>
-            <w:tcMar>
-              <w:top w:type="dxa" w:w="50"/>
-              <w:left w:type="dxa" w:w="80"/>
-              <w:bottom w:type="dxa" w:w="50"/>
-              <w:right w:type="dxa" w:w="80"/>
-            </w:tcMar>
-          </w:tcPr>
-          <w:p>
-            <w:pPr>
-              <w:spacing w:after="0"/>
-            </w:pPr>
-            <w:r>
-              <w:rPr>
-                <w:rFonts w:ascii="Arial" w:cs="Arial" w:eastAsia="Arial" w:hAnsi="Arial"/>
-                <w:b/>
-                <w:bCs/>
-                <w:color w:val="FFFFFF"/>
-                <w:sz w:val="17"/>
-                <w:szCs w:val="17"/>
-              </w:rPr>
-              <w:t xml:space="preserve">Where</w:t>
-            </w:r>
-          </w:p>
-        </w:tc>
-        <w:tc>
-          <w:tcPr>
-            <w:tcW w:type="dxa" w:w="6318"/>
-            <w:tcBorders>
-              <w:top w:val="single" w:color="8C8C8C" w:sz="4"/>
-              <w:left w:val="single" w:color="8C8C8C" w:sz="4"/>
-              <w:bottom w:val="single" w:color="8C8C8C" w:sz="4"/>
-              <w:right w:val="single" w:color="8C8C8C" w:sz="4"/>
-            </w:tcBorders>
-            <w:shd w:fill="1F3864" w:color="auto" w:val="clear"/>
-            <w:tcMar>
-              <w:top w:type="dxa" w:w="50"/>
-              <w:left w:type="dxa" w:w="80"/>
-              <w:bottom w:type="dxa" w:w="50"/>
-              <w:right w:type="dxa" w:w="80"/>
-            </w:tcMar>
-          </w:tcPr>
-          <w:p>
-            <w:pPr>
-              <w:spacing w:after="0"/>
-            </w:pPr>
-            <w:r>
-              <w:rPr>
-                <w:rFonts w:ascii="Arial" w:cs="Arial" w:eastAsia="Arial" w:hAnsi="Arial"/>
-                <w:b/>
-                <w:bCs/>
-                <w:color w:val="FFFFFF"/>
-                <w:sz w:val="17"/>
-                <w:szCs w:val="17"/>
-              </w:rPr>
-              <w:t xml:space="preserve">What to add</w:t>
-            </w:r>
-          </w:p>
-        </w:tc>
-      </w:tr>
-      <w:tr>
-        <w:trPr>
-          <w:cantSplit/>
-        </w:trPr>
-        <w:tc>
-          <w:tcPr>
-            <w:tcW w:type="dxa" w:w="451"/>
-            <w:tcBorders>
-              <w:top w:val="single" w:color="8C8C8C" w:sz="4"/>
-              <w:left w:val="single" w:color="8C8C8C" w:sz="4"/>
-              <w:bottom w:val="single" w:color="8C8C8C" w:sz="4"/>
-              <w:right w:val="single" w:color="8C8C8C" w:sz="4"/>
-            </w:tcBorders>
-            <w:tcMar>
-              <w:top w:type="dxa" w:w="50"/>
-              <w:left w:type="dxa" w:w="80"/>
-              <w:bottom w:type="dxa" w:w="50"/>
-              <w:right w:type="dxa" w:w="80"/>
-            </w:tcMar>
-          </w:tcPr>
-          <w:p>
-            <w:pPr>
-              <w:spacing w:after="0"/>
-            </w:pPr>
-            <w:r>
-              <w:rPr>
-                <w:rFonts w:ascii="Arial" w:cs="Arial" w:eastAsia="Arial" w:hAnsi="Arial"/>
-                <w:b w:val="false"/>
-                <w:bCs w:val="false"/>
-                <w:sz w:val="17"/>
-                <w:szCs w:val="17"/>
-              </w:rPr>
-              <w:t xml:space="preserve">1</w:t>
-            </w:r>
-          </w:p>
-        </w:tc>
-        <w:tc>
-          <w:tcPr>
-            <w:tcW w:type="dxa" w:w="2257"/>
-            <w:tcBorders>
-              <w:top w:val="single" w:color="8C8C8C" w:sz="4"/>
-              <w:left w:val="single" w:color="8C8C8C" w:sz="4"/>
-              <w:bottom w:val="single" w:color="8C8C8C" w:sz="4"/>
-              <w:right w:val="single" w:color="8C8C8C" w:sz="4"/>
-            </w:tcBorders>
-            <w:tcMar>
-              <w:top w:type="dxa" w:w="50"/>
-              <w:left w:type="dxa" w:w="80"/>
-              <w:bottom w:type="dxa" w:w="50"/>
-              <w:right w:type="dxa" w:w="80"/>
-            </w:tcMar>
-          </w:tcPr>
-          <w:p>
-            <w:pPr>
-              <w:spacing w:after="0"/>
-            </w:pPr>
-            <w:r>
-              <w:rPr>
-                <w:rFonts w:ascii="Arial" w:cs="Arial" w:eastAsia="Arial" w:hAnsi="Arial"/>
-                <w:b w:val="false"/>
-                <w:bCs w:val="false"/>
-                <w:sz w:val="17"/>
-                <w:szCs w:val="17"/>
-              </w:rPr>
-              <w:t xml:space="preserve">Cover page</w:t>
-            </w:r>
-          </w:p>
-        </w:tc>
-        <w:tc>
-          <w:tcPr>
-            <w:tcW w:type="dxa" w:w="6318"/>
-            <w:tcBorders>
-              <w:top w:val="single" w:color="8C8C8C" w:sz="4"/>
-              <w:left w:val="single" w:color="8C8C8C" w:sz="4"/>
-              <w:bottom w:val="single" w:color="8C8C8C" w:sz="4"/>
-              <w:right w:val="single" w:color="8C8C8C" w:sz="4"/>
-            </w:tcBorders>
-            <w:tcMar>
-              <w:top w:type="dxa" w:w="50"/>
-              <w:left w:type="dxa" w:w="80"/>
-              <w:bottom w:type="dxa" w:w="50"/>
-              <w:right w:type="dxa" w:w="80"/>
-            </w:tcMar>
-          </w:tcPr>
-          <w:p>
-            <w:pPr>
-              <w:spacing w:after="0"/>
-            </w:pPr>
-            <w:r>
-              <w:rPr>
-                <w:rFonts w:ascii="Arial" w:cs="Arial" w:eastAsia="Arial" w:hAnsi="Arial"/>
-                <w:b w:val="false"/>
-                <w:bCs w:val="false"/>
-                <w:sz w:val="17"/>
-                <w:szCs w:val="17"/>
-              </w:rPr>
-              <w:t xml:space="preserve">Lecturer / lab group; change the submission date if you upload after 8 October 2026.</w:t>
-            </w:r>
-          </w:p>
-        </w:tc>
-      </w:tr>
-      <w:tr>
-        <w:trPr>
-          <w:cantSplit/>
-        </w:trPr>
-        <w:tc>
-          <w:tcPr>
-            <w:tcW w:type="dxa" w:w="451"/>
-            <w:tcBorders>
-              <w:top w:val="single" w:color="8C8C8C" w:sz="4"/>
-              <w:left w:val="single" w:color="8C8C8C" w:sz="4"/>
-              <w:bottom w:val="single" w:color="8C8C8C" w:sz="4"/>
-              <w:right w:val="single" w:color="8C8C8C" w:sz="4"/>
-            </w:tcBorders>
-            <w:tcMar>
-              <w:top w:type="dxa" w:w="50"/>
-              <w:left w:type="dxa" w:w="80"/>
-              <w:bottom w:type="dxa" w:w="50"/>
-              <w:right w:type="dxa" w:w="80"/>
-            </w:tcMar>
-          </w:tcPr>
-          <w:p>
-            <w:pPr>
-              <w:spacing w:after="0"/>
-            </w:pPr>
-            <w:r>
-              <w:rPr>
-                <w:rFonts w:ascii="Arial" w:cs="Arial" w:eastAsia="Arial" w:hAnsi="Arial"/>
-                <w:b w:val="false"/>
-                <w:bCs w:val="false"/>
-                <w:sz w:val="17"/>
-                <w:szCs w:val="17"/>
-              </w:rPr>
-              <w:t xml:space="preserve">2</w:t>
-            </w:r>
-          </w:p>
-        </w:tc>
-        <w:tc>
-          <w:tcPr>
-            <w:tcW w:type="dxa" w:w="2257"/>
-            <w:tcBorders>
-              <w:top w:val="single" w:color="8C8C8C" w:sz="4"/>
-              <w:left w:val="single" w:color="8C8C8C" w:sz="4"/>
-              <w:bottom w:val="single" w:color="8C8C8C" w:sz="4"/>
-              <w:right w:val="single" w:color="8C8C8C" w:sz="4"/>
-            </w:tcBorders>
-            <w:tcMar>
-              <w:top w:type="dxa" w:w="50"/>
-              <w:left w:type="dxa" w:w="80"/>
-              <w:bottom w:type="dxa" w:w="50"/>
-              <w:right w:type="dxa" w:w="80"/>
-            </w:tcMar>
-          </w:tcPr>
-          <w:p>
-            <w:pPr>
-              <w:spacing w:after="0"/>
-            </w:pPr>
-            <w:r>
-              <w:rPr>
-                <w:rFonts w:ascii="Arial" w:cs="Arial" w:eastAsia="Arial" w:hAnsi="Arial"/>
-                <w:b w:val="false"/>
-                <w:bCs w:val="false"/>
-                <w:sz w:val="17"/>
-                <w:szCs w:val="17"/>
-              </w:rPr>
-              <w:t xml:space="preserve">2.4 Responsibilities</w:t>
-            </w:r>
-          </w:p>
-        </w:tc>
-        <w:tc>
-          <w:tcPr>
-            <w:tcW w:type="dxa" w:w="6318"/>
-            <w:tcBorders>
-              <w:top w:val="single" w:color="8C8C8C" w:sz="4"/>
-              <w:left w:val="single" w:color="8C8C8C" w:sz="4"/>
-              <w:bottom w:val="single" w:color="8C8C8C" w:sz="4"/>
-              <w:right w:val="single" w:color="8C8C8C" w:sz="4"/>
-            </w:tcBorders>
-            <w:tcMar>
-              <w:top w:type="dxa" w:w="50"/>
-              <w:left w:type="dxa" w:w="80"/>
-              <w:bottom w:type="dxa" w:w="50"/>
-              <w:right w:type="dxa" w:w="80"/>
-            </w:tcMar>
-          </w:tcPr>
-          <w:p>
-            <w:pPr>
-              <w:spacing w:after="0"/>
-            </w:pPr>
-            <w:r>
-              <w:rPr>
-                <w:rFonts w:ascii="Arial" w:cs="Arial" w:eastAsia="Arial" w:hAnsi="Arial"/>
-                <w:b w:val="false"/>
-                <w:bCs w:val="false"/>
-                <w:sz w:val="17"/>
-                <w:szCs w:val="17"/>
-              </w:rPr>
-              <w:t xml:space="preserve">Confirm the allocation matches what each member actually did.</w:t>
-            </w:r>
-          </w:p>
-        </w:tc>
-      </w:tr>
-      <w:tr>
-        <w:trPr>
-          <w:cantSplit/>
-        </w:trPr>
-        <w:tc>
-          <w:tcPr>
-            <w:tcW w:type="dxa" w:w="451"/>
-            <w:tcBorders>
-              <w:top w:val="single" w:color="8C8C8C" w:sz="4"/>
-              <w:left w:val="single" w:color="8C8C8C" w:sz="4"/>
-              <w:bottom w:val="single" w:color="8C8C8C" w:sz="4"/>
-              <w:right w:val="single" w:color="8C8C8C" w:sz="4"/>
-            </w:tcBorders>
-            <w:tcMar>
-              <w:top w:type="dxa" w:w="50"/>
-              <w:left w:type="dxa" w:w="80"/>
-              <w:bottom w:type="dxa" w:w="50"/>
-              <w:right w:type="dxa" w:w="80"/>
-            </w:tcMar>
-          </w:tcPr>
-          <w:p>
-            <w:pPr>
-              <w:spacing w:after="0"/>
-            </w:pPr>
-            <w:r>
-              <w:rPr>
-                <w:rFonts w:ascii="Arial" w:cs="Arial" w:eastAsia="Arial" w:hAnsi="Arial"/>
-                <w:b w:val="false"/>
-                <w:bCs w:val="false"/>
-                <w:sz w:val="17"/>
-                <w:szCs w:val="17"/>
-              </w:rPr>
-              <w:t xml:space="preserve">3</w:t>
-            </w:r>
-          </w:p>
-        </w:tc>
-        <w:tc>
-          <w:tcPr>
-            <w:tcW w:type="dxa" w:w="2257"/>
-            <w:tcBorders>
-              <w:top w:val="single" w:color="8C8C8C" w:sz="4"/>
-              <w:left w:val="single" w:color="8C8C8C" w:sz="4"/>
-              <w:bottom w:val="single" w:color="8C8C8C" w:sz="4"/>
-              <w:right w:val="single" w:color="8C8C8C" w:sz="4"/>
-            </w:tcBorders>
-            <w:tcMar>
-              <w:top w:type="dxa" w:w="50"/>
-              <w:left w:type="dxa" w:w="80"/>
-              <w:bottom w:type="dxa" w:w="50"/>
-              <w:right w:type="dxa" w:w="80"/>
-            </w:tcMar>
-          </w:tcPr>
-          <w:p>
-            <w:pPr>
-              <w:spacing w:after="0"/>
-            </w:pPr>
-            <w:r>
-              <w:rPr>
-                <w:rFonts w:ascii="Arial" w:cs="Arial" w:eastAsia="Arial" w:hAnsi="Arial"/>
-                <w:b w:val="false"/>
-                <w:bCs w:val="false"/>
-                <w:sz w:val="17"/>
-                <w:szCs w:val="17"/>
-              </w:rPr>
-              <w:t xml:space="preserve">2.5 Schedule</w:t>
-            </w:r>
-          </w:p>
-        </w:tc>
-        <w:tc>
-          <w:tcPr>
-            <w:tcW w:type="dxa" w:w="6318"/>
-            <w:tcBorders>
-              <w:top w:val="single" w:color="8C8C8C" w:sz="4"/>
-              <w:left w:val="single" w:color="8C8C8C" w:sz="4"/>
-              <w:bottom w:val="single" w:color="8C8C8C" w:sz="4"/>
-              <w:right w:val="single" w:color="8C8C8C" w:sz="4"/>
-            </w:tcBorders>
-            <w:tcMar>
-              <w:top w:type="dxa" w:w="50"/>
-              <w:left w:type="dxa" w:w="80"/>
-              <w:bottom w:type="dxa" w:w="50"/>
-              <w:right w:type="dxa" w:w="80"/>
-            </w:tcMar>
-          </w:tcPr>
-          <w:p>
-            <w:pPr>
-              <w:spacing w:after="0"/>
-            </w:pPr>
-            <w:r>
-              <w:rPr>
-                <w:rFonts w:ascii="Arial" w:cs="Arial" w:eastAsia="Arial" w:hAnsi="Arial"/>
-                <w:b w:val="false"/>
-                <w:bCs w:val="false"/>
-                <w:sz w:val="17"/>
-                <w:szCs w:val="17"/>
-              </w:rPr>
-              <w:t xml:space="preserve">Real dates for phases 1 and 2 (planning and test-case design).</w:t>
-            </w:r>
-          </w:p>
-        </w:tc>
-      </w:tr>
-      <w:tr>
-        <w:trPr>
-          <w:cantSplit/>
-        </w:trPr>
-        <w:tc>
-          <w:tcPr>
-            <w:tcW w:type="dxa" w:w="451"/>
-            <w:tcBorders>
-              <w:top w:val="single" w:color="8C8C8C" w:sz="4"/>
-              <w:left w:val="single" w:color="8C8C8C" w:sz="4"/>
-              <w:bottom w:val="single" w:color="8C8C8C" w:sz="4"/>
-              <w:right w:val="single" w:color="8C8C8C" w:sz="4"/>
-            </w:tcBorders>
-            <w:tcMar>
-              <w:top w:type="dxa" w:w="50"/>
-              <w:left w:type="dxa" w:w="80"/>
-              <w:bottom w:type="dxa" w:w="50"/>
-              <w:right w:type="dxa" w:w="80"/>
-            </w:tcMar>
-          </w:tcPr>
-          <w:p>
-            <w:pPr>
-              <w:spacing w:after="0"/>
-            </w:pPr>
-            <w:r>
-              <w:rPr>
-                <w:rFonts w:ascii="Arial" w:cs="Arial" w:eastAsia="Arial" w:hAnsi="Arial"/>
-                <w:b w:val="false"/>
-                <w:bCs w:val="false"/>
-                <w:sz w:val="17"/>
-                <w:szCs w:val="17"/>
-              </w:rPr>
-              <w:t xml:space="preserve">7</w:t>
-            </w:r>
-          </w:p>
-        </w:tc>
-        <w:tc>
-          <w:tcPr>
-            <w:tcW w:type="dxa" w:w="2257"/>
-            <w:tcBorders>
-              <w:top w:val="single" w:color="8C8C8C" w:sz="4"/>
-              <w:left w:val="single" w:color="8C8C8C" w:sz="4"/>
-              <w:bottom w:val="single" w:color="8C8C8C" w:sz="4"/>
-              <w:right w:val="single" w:color="8C8C8C" w:sz="4"/>
-            </w:tcBorders>
-            <w:tcMar>
-              <w:top w:type="dxa" w:w="50"/>
-              <w:left w:type="dxa" w:w="80"/>
-              <w:bottom w:type="dxa" w:w="50"/>
-              <w:right w:type="dxa" w:w="80"/>
-            </w:tcMar>
-          </w:tcPr>
-          <w:p>
-            <w:pPr>
-              <w:spacing w:after="0"/>
-            </w:pPr>
-            <w:r>
-              <w:rPr>
-                <w:rFonts w:ascii="Arial" w:cs="Arial" w:eastAsia="Arial" w:hAnsi="Arial"/>
-                <w:b w:val="false"/>
-                <w:bCs w:val="false"/>
-                <w:sz w:val="17"/>
-                <w:szCs w:val="17"/>
-              </w:rPr>
-              <w:t xml:space="preserve">8.2 Defects found 8 Oct</w:t>
-            </w:r>
-          </w:p>
-        </w:tc>
-        <w:tc>
-          <w:tcPr>
-            <w:tcW w:type="dxa" w:w="6318"/>
-            <w:tcBorders>
-              <w:top w:val="single" w:color="8C8C8C" w:sz="4"/>
-              <w:left w:val="single" w:color="8C8C8C" w:sz="4"/>
-              <w:bottom w:val="single" w:color="8C8C8C" w:sz="4"/>
-              <w:right w:val="single" w:color="8C8C8C" w:sz="4"/>
-            </w:tcBorders>
-            <w:tcMar>
-              <w:top w:type="dxa" w:w="50"/>
-              <w:left w:type="dxa" w:w="80"/>
-              <w:bottom w:type="dxa" w:w="50"/>
-              <w:right w:type="dxa" w:w="80"/>
-            </w:tcMar>
-          </w:tcPr>
-          <w:p>
-            <w:pPr>
-              <w:spacing w:after="0"/>
-            </w:pPr>
-            <w:r>
-              <w:rPr>
-                <w:rFonts w:ascii="Arial" w:cs="Arial" w:eastAsia="Arial" w:hAnsi="Arial"/>
-                <w:b w:val="false"/>
-                <w:bCs w:val="false"/>
-                <w:sz w:val="17"/>
-                <w:szCs w:val="17"/>
-              </w:rPr>
-              <w:t xml:space="preserve">Member who supervised the 8 October runs (4.1) and who reviewed each fix (8.2).</w:t>
-            </w:r>
-          </w:p>
-        </w:tc>
-      </w:tr>
-      <w:tr>
-        <w:trPr>
-          <w:cantSplit/>
-        </w:trPr>
-        <w:tc>
-          <w:tcPr>
-            <w:tcW w:type="dxa" w:w="451"/>
-            <w:tcBorders>
-              <w:top w:val="single" w:color="8C8C8C" w:sz="4"/>
-              <w:left w:val="single" w:color="8C8C8C" w:sz="4"/>
-              <w:bottom w:val="single" w:color="8C8C8C" w:sz="4"/>
-              <w:right w:val="single" w:color="8C8C8C" w:sz="4"/>
-            </w:tcBorders>
-            <w:tcMar>
-              <w:top w:type="dxa" w:w="50"/>
-              <w:left w:type="dxa" w:w="80"/>
-              <w:bottom w:type="dxa" w:w="50"/>
-              <w:right w:type="dxa" w:w="80"/>
-            </w:tcMar>
-          </w:tcPr>
-          <w:p>
-            <w:pPr>
-              <w:spacing w:after="0"/>
-            </w:pPr>
-            <w:r>
-              <w:rPr>
-                <w:rFonts w:ascii="Arial" w:cs="Arial" w:eastAsia="Arial" w:hAnsi="Arial"/>
-                <w:b w:val="false"/>
-                <w:bCs w:val="false"/>
-                <w:sz w:val="17"/>
-                <w:szCs w:val="17"/>
-              </w:rPr>
-              <w:t xml:space="preserve">8</w:t>
-            </w:r>
-          </w:p>
-        </w:tc>
-        <w:tc>
-          <w:tcPr>
-            <w:tcW w:type="dxa" w:w="2257"/>
-            <w:tcBorders>
-              <w:top w:val="single" w:color="8C8C8C" w:sz="4"/>
-              <w:left w:val="single" w:color="8C8C8C" w:sz="4"/>
-              <w:bottom w:val="single" w:color="8C8C8C" w:sz="4"/>
-              <w:right w:val="single" w:color="8C8C8C" w:sz="4"/>
-            </w:tcBorders>
-            <w:tcMar>
-              <w:top w:type="dxa" w:w="50"/>
-              <w:left w:type="dxa" w:w="80"/>
-              <w:bottom w:type="dxa" w:w="50"/>
-              <w:right w:type="dxa" w:w="80"/>
-            </w:tcMar>
-          </w:tcPr>
-          <w:p>
-            <w:pPr>
-              <w:spacing w:after="0"/>
-            </w:pPr>
-            <w:r>
-              <w:rPr>
-                <w:rFonts w:ascii="Arial" w:cs="Arial" w:eastAsia="Arial" w:hAnsi="Arial"/>
-                <w:b w:val="false"/>
-                <w:bCs w:val="false"/>
-                <w:sz w:val="17"/>
-                <w:szCs w:val="17"/>
-              </w:rPr>
-              <w:t xml:space="preserve">9 Individual contribution</w:t>
-            </w:r>
-          </w:p>
-        </w:tc>
-        <w:tc>
-          <w:tcPr>
-            <w:tcW w:type="dxa" w:w="6318"/>
-            <w:tcBorders>
-              <w:top w:val="single" w:color="8C8C8C" w:sz="4"/>
-              <w:left w:val="single" w:color="8C8C8C" w:sz="4"/>
-              <w:bottom w:val="single" w:color="8C8C8C" w:sz="4"/>
-              <w:right w:val="single" w:color="8C8C8C" w:sz="4"/>
-            </w:tcBorders>
-            <w:tcMar>
-              <w:top w:type="dxa" w:w="50"/>
-              <w:left w:type="dxa" w:w="80"/>
-              <w:bottom w:type="dxa" w:w="50"/>
-              <w:right w:type="dxa" w:w="80"/>
-            </w:tcMar>
-          </w:tcPr>
-          <w:p>
-            <w:pPr>
-              <w:spacing w:after="0"/>
-            </w:pPr>
-            <w:r>
-              <w:rPr>
-                <w:rFonts w:ascii="Arial" w:cs="Arial" w:eastAsia="Arial" w:hAnsi="Arial"/>
-                <w:b w:val="false"/>
-                <w:bCs w:val="false"/>
-                <w:sz w:val="17"/>
-                <w:szCs w:val="17"/>
-              </w:rPr>
-              <w:t xml:space="preserve">Four fields per member, written by that member in their own words.</w:t>
-            </w:r>
-          </w:p>
-        </w:tc>
-      </w:tr>
-      <w:tr>
-        <w:trPr>
-          <w:cantSplit/>
-        </w:trPr>
-        <w:tc>
-          <w:tcPr>
-            <w:tcW w:type="dxa" w:w="451"/>
-            <w:tcBorders>
-              <w:top w:val="single" w:color="8C8C8C" w:sz="4"/>
-              <w:left w:val="single" w:color="8C8C8C" w:sz="4"/>
-              <w:bottom w:val="single" w:color="8C8C8C" w:sz="4"/>
-              <w:right w:val="single" w:color="8C8C8C" w:sz="4"/>
-            </w:tcBorders>
-            <w:tcMar>
-              <w:top w:type="dxa" w:w="50"/>
-              <w:left w:type="dxa" w:w="80"/>
-              <w:bottom w:type="dxa" w:w="50"/>
-              <w:right w:type="dxa" w:w="80"/>
-            </w:tcMar>
-          </w:tcPr>
-          <w:p>
-            <w:pPr>
-              <w:spacing w:after="0"/>
-            </w:pPr>
-            <w:r>
-              <w:rPr>
-                <w:rFonts w:ascii="Arial" w:cs="Arial" w:eastAsia="Arial" w:hAnsi="Arial"/>
-                <w:b w:val="false"/>
-                <w:bCs w:val="false"/>
-                <w:sz w:val="17"/>
-                <w:szCs w:val="17"/>
-              </w:rPr>
-              <w:t xml:space="preserve">9</w:t>
-            </w:r>
-          </w:p>
-        </w:tc>
-        <w:tc>
-          <w:tcPr>
-            <w:tcW w:type="dxa" w:w="2257"/>
-            <w:tcBorders>
-              <w:top w:val="single" w:color="8C8C8C" w:sz="4"/>
-              <w:left w:val="single" w:color="8C8C8C" w:sz="4"/>
-              <w:bottom w:val="single" w:color="8C8C8C" w:sz="4"/>
-              <w:right w:val="single" w:color="8C8C8C" w:sz="4"/>
-            </w:tcBorders>
-            <w:tcMar>
-              <w:top w:type="dxa" w:w="50"/>
-              <w:left w:type="dxa" w:w="80"/>
-              <w:bottom w:type="dxa" w:w="50"/>
-              <w:right w:type="dxa" w:w="80"/>
-            </w:tcMar>
-          </w:tcPr>
-          <w:p>
-            <w:pPr>
-              <w:spacing w:after="0"/>
-            </w:pPr>
-            <w:r>
-              <w:rPr>
-                <w:rFonts w:ascii="Arial" w:cs="Arial" w:eastAsia="Arial" w:hAnsi="Arial"/>
-                <w:b w:val="false"/>
-                <w:bCs w:val="false"/>
-                <w:sz w:val="17"/>
-                <w:szCs w:val="17"/>
-              </w:rPr>
-              <w:t xml:space="preserve">10 AI declaration</w:t>
-            </w:r>
-          </w:p>
-        </w:tc>
-        <w:tc>
-          <w:tcPr>
-            <w:tcW w:type="dxa" w:w="6318"/>
-            <w:tcBorders>
-              <w:top w:val="single" w:color="8C8C8C" w:sz="4"/>
-              <w:left w:val="single" w:color="8C8C8C" w:sz="4"/>
-              <w:bottom w:val="single" w:color="8C8C8C" w:sz="4"/>
-              <w:right w:val="single" w:color="8C8C8C" w:sz="4"/>
-            </w:tcBorders>
-            <w:tcMar>
-              <w:top w:type="dxa" w:w="50"/>
-              <w:left w:type="dxa" w:w="80"/>
-              <w:bottom w:type="dxa" w:w="50"/>
-              <w:right w:type="dxa" w:w="80"/>
-            </w:tcMar>
-          </w:tcPr>
-          <w:p>
-            <w:pPr>
-              <w:spacing w:after="0"/>
-            </w:pPr>
-            <w:r>
-              <w:rPr>
-                <w:rFonts w:ascii="Arial" w:cs="Arial" w:eastAsia="Arial" w:hAnsi="Arial"/>
-                <w:b w:val="false"/>
-                <w:bCs w:val="false"/>
-                <w:sz w:val="17"/>
-                <w:szCs w:val="17"/>
-              </w:rPr>
-              <w:t xml:space="preserve">Each member’s CLEAR declaration using the module template.</w:t>
-            </w:r>
-          </w:p>
-        </w:tc>
-      </w:tr>
-      <w:tr>
-        <w:trPr>
-          <w:cantSplit/>
-        </w:trPr>
-        <w:tc>
-          <w:tcPr>
-            <w:tcW w:type="dxa" w:w="451"/>
-            <w:tcBorders>
-              <w:top w:val="single" w:color="8C8C8C" w:sz="4"/>
-              <w:left w:val="single" w:color="8C8C8C" w:sz="4"/>
-              <w:bottom w:val="single" w:color="8C8C8C" w:sz="4"/>
-              <w:right w:val="single" w:color="8C8C8C" w:sz="4"/>
-            </w:tcBorders>
-            <w:tcMar>
-              <w:top w:type="dxa" w:w="50"/>
-              <w:left w:type="dxa" w:w="80"/>
-              <w:bottom w:type="dxa" w:w="50"/>
-              <w:right w:type="dxa" w:w="80"/>
-            </w:tcMar>
-          </w:tcPr>
-          <w:p>
-            <w:pPr>
-              <w:spacing w:after="0"/>
-            </w:pPr>
-            <w:r>
-              <w:rPr>
-                <w:rFonts w:ascii="Arial" w:cs="Arial" w:eastAsia="Arial" w:hAnsi="Arial"/>
-                <w:b w:val="false"/>
-                <w:bCs w:val="false"/>
-                <w:sz w:val="17"/>
-                <w:szCs w:val="17"/>
-              </w:rPr>
-              <w:t xml:space="preserve">11</w:t>
-            </w:r>
-          </w:p>
-        </w:tc>
-        <w:tc>
-          <w:tcPr>
-            <w:tcW w:type="dxa" w:w="2257"/>
-            <w:tcBorders>
-              <w:top w:val="single" w:color="8C8C8C" w:sz="4"/>
-              <w:left w:val="single" w:color="8C8C8C" w:sz="4"/>
-              <w:bottom w:val="single" w:color="8C8C8C" w:sz="4"/>
-              <w:right w:val="single" w:color="8C8C8C" w:sz="4"/>
-            </w:tcBorders>
-            <w:tcMar>
-              <w:top w:type="dxa" w:w="50"/>
-              <w:left w:type="dxa" w:w="80"/>
-              <w:bottom w:type="dxa" w:w="50"/>
-              <w:right w:type="dxa" w:w="80"/>
-            </w:tcMar>
-          </w:tcPr>
-          <w:p>
-            <w:pPr>
-              <w:spacing w:after="0"/>
-            </w:pPr>
-            <w:r>
-              <w:rPr>
-                <w:rFonts w:ascii="Arial" w:cs="Arial" w:eastAsia="Arial" w:hAnsi="Arial"/>
-                <w:b w:val="false"/>
-                <w:bCs w:val="false"/>
-                <w:sz w:val="17"/>
-                <w:szCs w:val="17"/>
-              </w:rPr>
-              <w:t xml:space="preserve">Whole document</w:t>
-            </w:r>
-          </w:p>
-        </w:tc>
-        <w:tc>
-          <w:tcPr>
-            <w:tcW w:type="dxa" w:w="6318"/>
-            <w:tcBorders>
-              <w:top w:val="single" w:color="8C8C8C" w:sz="4"/>
-              <w:left w:val="single" w:color="8C8C8C" w:sz="4"/>
-              <w:bottom w:val="single" w:color="8C8C8C" w:sz="4"/>
-              <w:right w:val="single" w:color="8C8C8C" w:sz="4"/>
-            </w:tcBorders>
-            <w:tcMar>
-              <w:top w:type="dxa" w:w="50"/>
-              <w:left w:type="dxa" w:w="80"/>
-              <w:bottom w:type="dxa" w:w="50"/>
-              <w:right w:type="dxa" w:w="80"/>
-            </w:tcMar>
-          </w:tcPr>
-          <w:p>
-            <w:pPr>
-              <w:spacing w:after="0"/>
-            </w:pPr>
-            <w:r>
-              <w:rPr>
-                <w:rFonts w:ascii="Arial" w:cs="Arial" w:eastAsia="Arial" w:hAnsi="Arial"/>
-                <w:b w:val="false"/>
-                <w:bCs w:val="false"/>
-                <w:sz w:val="17"/>
-                <w:szCs w:val="17"/>
-              </w:rPr>
-              <w:t xml:space="preserve">Update the table of contents (right-click → Update field) and export to PDF.</w:t>
-            </w:r>
-          </w:p>
-        </w:tc>
-      </w:tr>
-    </w:tbl>
     <w:p>
       <w:r>
         <w:br w:type="page"/>
@@ -1972,39 +1101,100 @@
         <w:t xml:space="preserve">Contents</w:t>
       </w:r>
     </w:p>
-    <w:sdt>
-      <w:sdtPr>
-        <w:alias w:val="Contents"/>
-      </w:sdtPr>
-      <w:sdtContent>
-        <w:p>
-          <w:r>
-            <w:fldChar w:fldCharType="begin" w:dirty="true"/>
-            <w:instrText xml:space="preserve">TOC \h \o "1-2"</w:instrText>
-            <w:fldChar w:fldCharType="separate"/>
-          </w:r>
-        </w:p>
-        <w:p>
-          <w:r>
-            <w:fldChar w:fldCharType="end"/>
-          </w:r>
-        </w:p>
-      </w:sdtContent>
-    </w:sdt>
     <w:p>
       <w:pPr>
-        <w:spacing w:after="120" w:line="276"/>
+        <w:spacing w:after="180"/>
       </w:pPr>
       <w:r>
-        <w:rPr>
-          <w:rFonts w:ascii="Arial" w:cs="Arial" w:eastAsia="Arial" w:hAnsi="Arial"/>
-          <w:b/>
-          <w:bCs/>
-          <w:color w:val="C00000"/>
-          <w:sz w:val="20"/>
-          <w:szCs w:val="20"/>
-        </w:rPr>
-        <w:t xml:space="preserve">[In Word: right-click the table of contents → Update field → Update entire table. Delete this line.]</w:t>
+        <w:t>1. Introduction</w:t>
+      </w:r>
+    </w:p>
+    <w:p>
+      <w:pPr>
+        <w:spacing w:after="180"/>
+      </w:pPr>
+      <w:r>
+        <w:t>2. Test Plan</w:t>
+      </w:r>
+    </w:p>
+    <w:p>
+      <w:pPr>
+        <w:spacing w:after="180"/>
+      </w:pPr>
+      <w:r>
+        <w:t>3. Test Case Document</w:t>
+      </w:r>
+    </w:p>
+    <w:p>
+      <w:pPr>
+        <w:spacing w:after="180"/>
+      </w:pPr>
+      <w:r>
+        <w:t>4. Test Execution Summary</w:t>
+      </w:r>
+    </w:p>
+    <w:p>
+      <w:pPr>
+        <w:spacing w:after="180"/>
+      </w:pPr>
+      <w:r>
+        <w:t>5. Integration and End-to-End Testing</w:t>
+      </w:r>
+    </w:p>
+    <w:p>
+      <w:pPr>
+        <w:spacing w:after="180"/>
+      </w:pPr>
+      <w:r>
+        <w:t>6. Non-Functional Testing</w:t>
+      </w:r>
+    </w:p>
+    <w:p>
+      <w:pPr>
+        <w:spacing w:after="180"/>
+      </w:pPr>
+      <w:r>
+        <w:t>7. Agentic AI Testing and Evaluation</w:t>
+      </w:r>
+    </w:p>
+    <w:p>
+      <w:pPr>
+        <w:spacing w:after="180"/>
+      </w:pPr>
+      <w:r>
+        <w:t>8. Defect Report and Retest Evidence</w:t>
+      </w:r>
+    </w:p>
+    <w:p>
+      <w:pPr>
+        <w:spacing w:after="180"/>
+      </w:pPr>
+      <w:r>
+        <w:t>9. Individual Contribution Evidence</w:t>
+      </w:r>
+    </w:p>
+    <w:p>
+      <w:pPr>
+        <w:spacing w:after="180"/>
+      </w:pPr>
+      <w:r>
+        <w:t>10. Declaration of AI Usage</w:t>
+      </w:r>
+    </w:p>
+    <w:p>
+      <w:pPr>
+        <w:spacing w:after="180"/>
+      </w:pPr>
+      <w:r>
+        <w:t>11. Limitations and Conclusion</w:t>
+      </w:r>
+    </w:p>
+    <w:p>
+      <w:pPr>
+        <w:spacing w:after="180"/>
+      </w:pPr>
+      <w:r>
+        <w:t>12. Evidence Index and How to Rerun</w:t>
       </w:r>
     </w:p>
     <w:p>
@@ -6345,11 +5535,11 @@
           <w:rFonts w:ascii="Arial" w:cs="Arial" w:eastAsia="Arial" w:hAnsi="Arial"/>
           <w:b/>
           <w:bCs/>
-          <w:color w:val="C00000"/>
+          <w:color w:val="000000"/>
           <w:sz w:val="20"/>
           <w:szCs w:val="20"/>
         </w:rPr>
-        <w:t xml:space="preserve">[CONFIRM: this allocation comes from the planning draft and docs/OWNERSHIP.tsv. Each member must check that their row matches what they actually did and can demonstrate; edit any row that does not.]</w:t>
+        <w:t>The allocation follows the component ownership recorded in docs/OWNERSHIP.tsv. Git evidence is listed in Section 9; personal execution, defect participation and viva declarations require the named member’s confirmation.</w:t>
       </w:r>
     </w:p>
     <w:p>
@@ -6647,11 +5837,11 @@
                 <w:rFonts w:ascii="Arial" w:cs="Arial" w:eastAsia="Arial" w:hAnsi="Arial"/>
                 <w:b/>
                 <w:bCs/>
-                <w:color w:val="C00000"/>
-                <w:sz w:val="17"/>
-                <w:szCs w:val="17"/>
-              </w:rPr>
-              <w:t xml:space="preserve">[ADD dates]</w:t>
+                <w:color w:val="000000"/>
+                <w:sz w:val="17"/>
+                <w:szCs w:val="17"/>
+              </w:rPr>
+              <w:t>8 Oct 2026 (documented); original planning date not recorded</w:t>
             </w:r>
           </w:p>
         </w:tc>
@@ -6781,11 +5971,11 @@
                 <w:rFonts w:ascii="Arial" w:cs="Arial" w:eastAsia="Arial" w:hAnsi="Arial"/>
                 <w:b/>
                 <w:bCs/>
-                <w:color w:val="C00000"/>
-                <w:sz w:val="17"/>
-                <w:szCs w:val="17"/>
-              </w:rPr>
-              <w:t xml:space="preserve">[ADD dates]</w:t>
+                <w:color w:val="000000"/>
+                <w:sz w:val="17"/>
+                <w:szCs w:val="17"/>
+              </w:rPr>
+              <w:t>8 Oct 2026 (documented); original planning date not recorded</w:t>
             </w:r>
           </w:p>
         </w:tc>
@@ -20351,7 +19541,7 @@
           <w:sz w:val="20"/>
           <w:szCs w:val="20"/>
         </w:rPr>
-        <w:t xml:space="preserve">430 + 30 + 343 + 256 = 1,059 passing tests, 0 failed</w:t>
+        <w:t>430 + 30 + 343 + 256 = 1,059 passing tests, 0 failed</w:t>
       </w:r>
       <w:r>
         <w:rPr>
@@ -20359,7 +19549,7 @@
           <w:sz w:val="20"/>
           <w:szCs w:val="20"/>
         </w:rPr>
-        <w:t xml:space="preserve">. The growth between rounds reflects tests added with the features delivered between the dates. The 5 October round is kept because its first run failed (two web tests, lint and build), which is the origin of defects D-008 and D-009.</w:t>
+        <w:t>. The growth between rounds reflects tests added with the features delivered between the dates. The 5 October round is kept because its first run failed (two web tests, lint and build), which is the origin of defects D-008 and D-009.</w:t>
       </w:r>
     </w:p>
     <w:p>
@@ -20382,10 +19572,11 @@
       <w:r>
         <w:rPr>
           <w:rFonts w:ascii="Arial" w:cs="Arial" w:eastAsia="Arial" w:hAnsi="Arial"/>
+          <w:color w:val="000000"/>
           <w:sz w:val="20"/>
           <w:szCs w:val="20"/>
         </w:rPr>
-        <w:t xml:space="preserve">The 8 October suites, scans and journeys were run with an AI coding agent on the MacBook of the repository account ImSahanS (Apple M4, macOS 27.0.1; Flutter 3.47.5, Node 22.23.2, .NET SDK 10.0.302 building the net8.0 projects). The suite logs above were taken at commit 3bb6c19; the fixes and evidence described in sections 5 and 8 were merged afterwards, and develop is at commit 4ed0c28.</w:t>
+        <w:t>The 8 October suites, scans and journeys were run with an AI coding agent on the MacBook of repository account ImSahanS (Apple M4, macOS 27.0.1; Flutter 3.47.5, Node 22.23.2, .NET SDK 10.0.302 building net8.0 projects). The baseline suites and coverage were recorded at 3bb6c19. Fixes and evidence were subsequently merged through 4ed0c28; the current documentation revision is 195c0d3. Fresh backend unit and Flutter verification at 195c0d3 is retained in the logs below. Supervising member: ____________________.</w:t>
       </w:r>
       <w:r>
         <w:rPr>
@@ -20396,7 +19587,6 @@
           <w:sz w:val="20"/>
           <w:szCs w:val="20"/>
         </w:rPr>
-        <w:t xml:space="preserve"> [ADD: name of the member who supervised these runs.]</w:t>
       </w:r>
     </w:p>
     <w:p>
@@ -20406,10 +19596,11 @@
       <w:r>
         <w:rPr>
           <w:rFonts w:ascii="Arial" w:cs="Arial" w:eastAsia="Arial" w:hAnsi="Arial"/>
+          <w:color w:val="000000"/>
           <w:sz w:val="20"/>
           <w:szCs w:val="20"/>
         </w:rPr>
-        <w:t xml:space="preserve">After the fixes the suites were rerun on 8 October: the full React suite passed 344 of 344 tests in 57 files (08-after-fix-web-full-suite.txt), the backend integration suite 31 of 31, the backend unit suite 430 of 430 and the Flutter suite 258 of 258.</w:t>
+        <w:t>After the fixes, the full React suite passed 344/344 tests in 57 files (08-after-fix-web-full-suite.txt) and backend integration passed 31/31 (02-after-fix-integration.txt). Current-revision verification passed backend unit 430/430 (11-current-backend-unit.txt) and Flutter 258/258 (09-current-flutter-full-suite.txt); flutter analyze reported no issues (10-current-flutter-analyze.txt). These are 1,063 passing tests across the four suites, with no failures. Logs are under evidence/2026-10-08-defect-retest/.</w:t>
       </w:r>
     </w:p>
     <w:p>
@@ -20419,8 +19610,9 @@
       <w:r>
         <w:rPr>
           <w:rFonts w:ascii="Arial" w:cs="Arial" w:eastAsia="Arial" w:hAnsi="Arial"/>
+          <w:color w:val="000000"/>
         </w:rPr>
-        <w:t xml:space="preserve">4.2 Code coverage (8 October)</w:t>
+        <w:t>4.2 Code coverage before the fixes (8 October)</w:t>
       </w:r>
     </w:p>
     <w:p>
@@ -21143,10 +20335,11 @@
       <w:r>
         <w:rPr>
           <w:rFonts w:ascii="Arial" w:cs="Arial" w:eastAsia="Arial" w:hAnsi="Arial"/>
+          <w:color w:val="000000"/>
           <w:sz w:val="20"/>
           <w:szCs w:val="20"/>
         </w:rPr>
-        <w:t xml:space="preserve">The figures are reported per suite and are not averaged into one number, because the scopes differ. The backend denominator includes generated EF Core migration code, which lowers the overall percentage. The unit run covers the Application layer well (672 / 873 lines, 76.98%) but hardly touches controllers and persistence, which the integration run covers instead.</w:t>
+        <w:t>The figures are reported per suite and are not averaged into one number, because the scopes differ. The backend denominator includes generated EF Core migration code, which lowers the overall percentage. The unit run covers the Application layer well (672 / 873 lines, 76.98%) but hardly touches controllers and persistence, which the integration run covers instead. These percentages belong to the pre-fix 430/30/343/256 test runs, not the subsequent 430/31/344/258 runs. Application unit line coverage of 76.98% is below the repository’s 80% service-layer gate; after-fix coverage has not been recalculated.</w:t>
       </w:r>
     </w:p>
     <w:p>
@@ -21339,18 +20532,8 @@
             </w:tcMar>
           </w:tcPr>
           <w:p>
-            <w:pPr>
-              <w:spacing w:after="0"/>
-            </w:pPr>
-            <w:r>
-              <w:rPr>
-                <w:rFonts w:ascii="Arial" w:cs="Arial" w:eastAsia="Arial" w:hAnsi="Arial"/>
-                <w:b w:val="false"/>
-                <w:bCs w:val="false"/>
-                <w:sz w:val="17"/>
-                <w:szCs w:val="17"/>
-              </w:rPr>
-              <w:t xml:space="preserve">Automated tests executed, 8 October</w:t>
+            <w:r>
+              <w:t>Automated tests, baseline / after fixes</w:t>
             </w:r>
           </w:p>
         </w:tc>
@@ -21371,18 +20554,8 @@
             </w:tcMar>
           </w:tcPr>
           <w:p>
-            <w:pPr>
-              <w:spacing w:after="0"/>
-            </w:pPr>
-            <w:r>
-              <w:rPr>
-                <w:rFonts w:ascii="Arial" w:cs="Arial" w:eastAsia="Arial" w:hAnsi="Arial"/>
-                <w:b w:val="false"/>
-                <w:bCs w:val="false"/>
-                <w:sz w:val="17"/>
-                <w:szCs w:val="17"/>
-              </w:rPr>
-              <w:t xml:space="preserve">1,059 executed, 1,059 passed, 0 failed</w:t>
+            <w:r>
+              <w:t>1,059 / 1,063 passed; 0 failed in either round</w:t>
             </w:r>
           </w:p>
         </w:tc>
@@ -22461,7 +21634,7 @@
           <w:sz w:val="20"/>
           <w:szCs w:val="20"/>
         </w:rPr>
-        <w:t xml:space="preserve">This run did its job: it exposed two High defects that 1,059 passing unit, component and integration tests had not, because each layer was correct in isolation and the fault lay in what the API handed to the patient clients. Both were fixed the same day (PR #176) with a regression test at every layer (Section 8.2).</w:t>
+        <w:t>This run did its job: it exposed two High defects that 1,059 passing unit, component and integration tests had not, because each layer was correct in isolation and the fault lay in what the API handed to the patient clients. Both were fixed the same day (PR #176) with a regression test at every layer (Section 8.2).</w:t>
       </w:r>
     </w:p>
     <w:p>
@@ -39137,10 +38310,11 @@
                 <w:rFonts w:ascii="Arial" w:cs="Arial" w:eastAsia="Arial" w:hAnsi="Arial"/>
                 <w:b w:val="false"/>
                 <w:bCs w:val="false"/>
-                <w:sz w:val="17"/>
-                <w:szCs w:val="17"/>
-              </w:rPr>
-              <w:t xml:space="preserve">06-after-fix-flutter-adult-family.txt</w:t>
+                <w:color w:val="000000"/>
+                <w:sz w:val="17"/>
+                <w:szCs w:val="17"/>
+              </w:rPr>
+              <w:t>06-after-fix-flutter-adult-family.txt; 09-current-flutter-full-suite.txt; 10-current-flutter-analyze.txt</w:t>
             </w:r>
           </w:p>
         </w:tc>
@@ -39317,10 +38491,11 @@
       <w:r>
         <w:rPr>
           <w:rFonts w:ascii="Arial" w:cs="Arial" w:eastAsia="Arial" w:hAnsi="Arial"/>
+          <w:color w:val="000000"/>
           <w:sz w:val="20"/>
           <w:szCs w:val="20"/>
         </w:rPr>
-        <w:t xml:space="preserve">All four defects were found during the 8 October test round run with the AI coding agent: QMSE-20261008-01 and -02 by the connected Flutter and web run, -03 while capturing the Adult screens on iOS, and -04 by the API journey script. The agent wrote the failing regression tests and the fixes under the repository account ImSahanS: commit bed063f (PR #176) for -01 and -02, commit 5dbf609 (PR #177) for -03, and the script correction in PR #177 for -04. The retests are the logs listed above.</w:t>
+        <w:t>All four defects were found during the 8 October test round run with the AI coding agent: QMSE-20261008-01 and -02 by the connected Flutter and web run, -03 while capturing the Adult screens on iOS, and -04 by the API journey script. The agent wrote the failing regression tests and the fixes under the repository account ImSahanS: commit bed063f (PR #176) for -01 and -02, commit 5dbf609 (PR #177) for -03, and the script correction in PR #177 for -04. The retests are the logs listed above. Git records the merges under ImSahanS; merge attribution does not establish independent review or viva competence. Fix reviewer and viva demonstrator: ____________________.</w:t>
       </w:r>
       <w:r>
         <w:rPr>
@@ -39331,7 +38506,6 @@
           <w:sz w:val="20"/>
           <w:szCs w:val="20"/>
         </w:rPr>
-        <w:t xml:space="preserve"> [ADD: the member who reviewed each fix and can explain and rerun its test in the viva.]</w:t>
       </w:r>
     </w:p>
     <w:p>
@@ -39475,10 +38649,11 @@
       <w:r>
         <w:rPr>
           <w:rFonts w:ascii="Arial" w:cs="Arial" w:eastAsia="Arial" w:hAnsi="Arial"/>
+          <w:color w:val="000000"/>
           <w:sz w:val="20"/>
           <w:szCs w:val="20"/>
         </w:rPr>
-        <w:t xml:space="preserve">The tables list test commits recorded in Git for each member (repository: https://github.com/sahansbandara/Family-Veda-SEF-Project). Git history shows recorded changes; the red fields must be completed by each member personally.</w:t>
+        <w:t>The tables list test commits recorded in Git for each member (repository: https://github.com/sahansbandara/Family-Veda-SEF-Project). Git history shows recorded changes. Each member must complete the blank personal execution, defect participation and viva fields; recorded ownership or AI-assisted execution alone does not establish individual demonstration.</w:t>
       </w:r>
     </w:p>
     <w:p>
@@ -40073,11 +39248,11 @@
                 <w:rFonts w:ascii="Arial" w:cs="Arial" w:eastAsia="Arial" w:hAnsi="Arial"/>
                 <w:b/>
                 <w:bCs/>
-                <w:color w:val="C00000"/>
-                <w:sz w:val="17"/>
-                <w:szCs w:val="17"/>
-              </w:rPr>
-              <w:t xml:space="preserve">[ADD: e.g. “cd mobile &amp;&amp; flutter test test/screens/… on 8 Oct 2026 — N passed”. Only what you ran yourself.]</w:t>
+                <w:color w:val="000000"/>
+                <w:sz w:val="17"/>
+                <w:szCs w:val="17"/>
+              </w:rPr>
+              <w:t>________________________________________________</w:t>
             </w:r>
           </w:p>
         </w:tc>
@@ -40143,11 +39318,11 @@
                 <w:rFonts w:ascii="Arial" w:cs="Arial" w:eastAsia="Arial" w:hAnsi="Arial"/>
                 <w:b/>
                 <w:bCs/>
-                <w:color w:val="C00000"/>
-                <w:sz w:val="17"/>
-                <w:szCs w:val="17"/>
-              </w:rPr>
-              <w:t xml:space="preserve">[ADD: defect ID, what you did, commit or PR number.]</w:t>
+                <w:color w:val="000000"/>
+                <w:sz w:val="17"/>
+                <w:szCs w:val="17"/>
+              </w:rPr>
+              <w:t>________________________________________________</w:t>
             </w:r>
           </w:p>
         </w:tc>
@@ -40213,11 +39388,11 @@
                 <w:rFonts w:ascii="Arial" w:cs="Arial" w:eastAsia="Arial" w:hAnsi="Arial"/>
                 <w:b/>
                 <w:bCs/>
-                <w:color w:val="C00000"/>
-                <w:sz w:val="17"/>
-                <w:szCs w:val="17"/>
-              </w:rPr>
-              <w:t xml:space="preserve">[ADD: test file and method; what you would change to add one more boundary or failure case.]</w:t>
+                <w:color w:val="000000"/>
+                <w:sz w:val="17"/>
+                <w:szCs w:val="17"/>
+              </w:rPr>
+              <w:t>________________________________________________</w:t>
             </w:r>
           </w:p>
         </w:tc>
@@ -40251,10 +39426,11 @@
                 <w:rFonts w:ascii="Arial" w:cs="Arial" w:eastAsia="Arial" w:hAnsi="Arial"/>
                 <w:b w:val="false"/>
                 <w:bCs w:val="false"/>
-                <w:sz w:val="17"/>
-                <w:szCs w:val="17"/>
-              </w:rPr>
-              <w:t xml:space="preserve">Why this tool and how it is configured</w:t>
+                <w:color w:val="000000"/>
+                <w:sz w:val="17"/>
+                <w:szCs w:val="17"/>
+              </w:rPr>
+              <w:t>Tool justification and configuration</w:t>
             </w:r>
           </w:p>
         </w:tc>
@@ -40283,11 +39459,11 @@
                 <w:rFonts w:ascii="Arial" w:cs="Arial" w:eastAsia="Arial" w:hAnsi="Arial"/>
                 <w:b/>
                 <w:bCs/>
-                <w:color w:val="C00000"/>
-                <w:sz w:val="17"/>
-                <w:szCs w:val="17"/>
-              </w:rPr>
-              <w:t xml:space="preserve">[ADD: 2–3 sentences in your own words.]</w:t>
+                <w:color w:val="000000"/>
+                <w:sz w:val="17"/>
+                <w:szCs w:val="17"/>
+              </w:rPr>
+              <w:t>xUnit and Moq isolate service behaviour; PostgreSQL integration tests use WebApplicationFactory and Testcontainers. Vitest with React Testing Library runs the web tests; flutter_test runs provider and widget tests with mocked dependencies. Commands and environment requirements are listed in Sections 2.3 and 12.</w:t>
             </w:r>
           </w:p>
         </w:tc>
@@ -40827,10 +40003,11 @@
                 <w:rFonts w:ascii="Arial" w:cs="Arial" w:eastAsia="Arial" w:hAnsi="Arial"/>
                 <w:b w:val="false"/>
                 <w:bCs w:val="false"/>
-                <w:sz w:val="17"/>
-                <w:szCs w:val="17"/>
-              </w:rPr>
-              <w:t xml:space="preserve">records_screen_test.dart; RecordsPage.test.tsx</w:t>
+                <w:color w:val="000000"/>
+                <w:sz w:val="17"/>
+                <w:szCs w:val="17"/>
+              </w:rPr>
+              <w:t>ExtractionAgentTests.cs; RecordServiceSortingTests.cs; records_screen_test.dart; RecordsPage.test.tsx</w:t>
             </w:r>
           </w:p>
         </w:tc>
@@ -40859,10 +40036,11 @@
                 <w:rFonts w:ascii="Arial" w:cs="Arial" w:eastAsia="Arial" w:hAnsi="Arial"/>
                 <w:b w:val="false"/>
                 <w:bCs w:val="false"/>
-                <w:sz w:val="17"/>
-                <w:szCs w:val="17"/>
-              </w:rPr>
-              <w:t xml:space="preserve">Vitest / RTL, flutter_test</w:t>
+                <w:color w:val="000000"/>
+                <w:sz w:val="17"/>
+                <w:szCs w:val="17"/>
+              </w:rPr>
+              <w:t>xUnit / Moq, Vitest / RTL, flutter_test</w:t>
             </w:r>
           </w:p>
         </w:tc>
@@ -41023,11 +40201,11 @@
                 <w:rFonts w:ascii="Arial" w:cs="Arial" w:eastAsia="Arial" w:hAnsi="Arial"/>
                 <w:b/>
                 <w:bCs/>
-                <w:color w:val="C00000"/>
-                <w:sz w:val="17"/>
-                <w:szCs w:val="17"/>
-              </w:rPr>
-              <w:t xml:space="preserve">[ADD: e.g. “cd mobile &amp;&amp; flutter test test/screens/… on 8 Oct 2026 — N passed”. Only what you ran yourself.]</w:t>
+                <w:color w:val="000000"/>
+                <w:sz w:val="17"/>
+                <w:szCs w:val="17"/>
+              </w:rPr>
+              <w:t>________________________________________________</w:t>
             </w:r>
           </w:p>
         </w:tc>
@@ -41093,11 +40271,11 @@
                 <w:rFonts w:ascii="Arial" w:cs="Arial" w:eastAsia="Arial" w:hAnsi="Arial"/>
                 <w:b/>
                 <w:bCs/>
-                <w:color w:val="C00000"/>
-                <w:sz w:val="17"/>
-                <w:szCs w:val="17"/>
-              </w:rPr>
-              <w:t xml:space="preserve">[ADD: defect ID, what you did, commit or PR number.]</w:t>
+                <w:color w:val="000000"/>
+                <w:sz w:val="17"/>
+                <w:szCs w:val="17"/>
+              </w:rPr>
+              <w:t>________________________________________________</w:t>
             </w:r>
           </w:p>
         </w:tc>
@@ -41163,11 +40341,11 @@
                 <w:rFonts w:ascii="Arial" w:cs="Arial" w:eastAsia="Arial" w:hAnsi="Arial"/>
                 <w:b/>
                 <w:bCs/>
-                <w:color w:val="C00000"/>
-                <w:sz w:val="17"/>
-                <w:szCs w:val="17"/>
-              </w:rPr>
-              <w:t xml:space="preserve">[ADD: test file and method; what you would change to add one more boundary or failure case.]</w:t>
+                <w:color w:val="000000"/>
+                <w:sz w:val="17"/>
+                <w:szCs w:val="17"/>
+              </w:rPr>
+              <w:t>________________________________________________</w:t>
             </w:r>
           </w:p>
         </w:tc>
@@ -41201,10 +40379,11 @@
                 <w:rFonts w:ascii="Arial" w:cs="Arial" w:eastAsia="Arial" w:hAnsi="Arial"/>
                 <w:b w:val="false"/>
                 <w:bCs w:val="false"/>
-                <w:sz w:val="17"/>
-                <w:szCs w:val="17"/>
-              </w:rPr>
-              <w:t xml:space="preserve">Why this tool and how it is configured</w:t>
+                <w:color w:val="000000"/>
+                <w:sz w:val="17"/>
+                <w:szCs w:val="17"/>
+              </w:rPr>
+              <w:t>Tool justification and configuration</w:t>
             </w:r>
           </w:p>
         </w:tc>
@@ -41233,11 +40412,11 @@
                 <w:rFonts w:ascii="Arial" w:cs="Arial" w:eastAsia="Arial" w:hAnsi="Arial"/>
                 <w:b/>
                 <w:bCs/>
-                <w:color w:val="C00000"/>
-                <w:sz w:val="17"/>
-                <w:szCs w:val="17"/>
-              </w:rPr>
-              <w:t xml:space="preserve">[ADD: 2–3 sentences in your own words.]</w:t>
+                <w:color w:val="000000"/>
+                <w:sz w:val="17"/>
+                <w:szCs w:val="17"/>
+              </w:rPr>
+              <w:t>xUnit and Moq isolate service behaviour; PostgreSQL integration tests use WebApplicationFactory and Testcontainers. Vitest with React Testing Library runs the web tests; flutter_test runs provider and widget tests with mocked dependencies. Commands and environment requirements are listed in Sections 2.3 and 12.</w:t>
             </w:r>
           </w:p>
         </w:tc>
@@ -41840,11 +41019,11 @@
                 <w:rFonts w:ascii="Arial" w:cs="Arial" w:eastAsia="Arial" w:hAnsi="Arial"/>
                 <w:b/>
                 <w:bCs/>
-                <w:color w:val="C00000"/>
-                <w:sz w:val="17"/>
-                <w:szCs w:val="17"/>
-              </w:rPr>
-              <w:t xml:space="preserve">[ADD: e.g. “cd mobile &amp;&amp; flutter test test/screens/… on 8 Oct 2026 — N passed”. Only what you ran yourself.]</w:t>
+                <w:color w:val="000000"/>
+                <w:sz w:val="17"/>
+                <w:szCs w:val="17"/>
+              </w:rPr>
+              <w:t>________________________________________________</w:t>
             </w:r>
           </w:p>
         </w:tc>
@@ -41910,11 +41089,11 @@
                 <w:rFonts w:ascii="Arial" w:cs="Arial" w:eastAsia="Arial" w:hAnsi="Arial"/>
                 <w:b/>
                 <w:bCs/>
-                <w:color w:val="C00000"/>
-                <w:sz w:val="17"/>
-                <w:szCs w:val="17"/>
-              </w:rPr>
-              <w:t xml:space="preserve">[ADD: defect ID, what you did, commit or PR number.]</w:t>
+                <w:color w:val="000000"/>
+                <w:sz w:val="17"/>
+                <w:szCs w:val="17"/>
+              </w:rPr>
+              <w:t>________________________________________________</w:t>
             </w:r>
           </w:p>
         </w:tc>
@@ -41980,11 +41159,11 @@
                 <w:rFonts w:ascii="Arial" w:cs="Arial" w:eastAsia="Arial" w:hAnsi="Arial"/>
                 <w:b/>
                 <w:bCs/>
-                <w:color w:val="C00000"/>
-                <w:sz w:val="17"/>
-                <w:szCs w:val="17"/>
-              </w:rPr>
-              <w:t xml:space="preserve">[ADD: test file and method; what you would change to add one more boundary or failure case.]</w:t>
+                <w:color w:val="000000"/>
+                <w:sz w:val="17"/>
+                <w:szCs w:val="17"/>
+              </w:rPr>
+              <w:t>________________________________________________</w:t>
             </w:r>
           </w:p>
         </w:tc>
@@ -42018,10 +41197,11 @@
                 <w:rFonts w:ascii="Arial" w:cs="Arial" w:eastAsia="Arial" w:hAnsi="Arial"/>
                 <w:b w:val="false"/>
                 <w:bCs w:val="false"/>
-                <w:sz w:val="17"/>
-                <w:szCs w:val="17"/>
-              </w:rPr>
-              <w:t xml:space="preserve">Why this tool and how it is configured</w:t>
+                <w:color w:val="000000"/>
+                <w:sz w:val="17"/>
+                <w:szCs w:val="17"/>
+              </w:rPr>
+              <w:t>Tool justification and configuration</w:t>
             </w:r>
           </w:p>
         </w:tc>
@@ -42050,11 +41230,11 @@
                 <w:rFonts w:ascii="Arial" w:cs="Arial" w:eastAsia="Arial" w:hAnsi="Arial"/>
                 <w:b/>
                 <w:bCs/>
-                <w:color w:val="C00000"/>
-                <w:sz w:val="17"/>
-                <w:szCs w:val="17"/>
-              </w:rPr>
-              <w:t xml:space="preserve">[ADD: 2–3 sentences in your own words.]</w:t>
+                <w:color w:val="000000"/>
+                <w:sz w:val="17"/>
+                <w:szCs w:val="17"/>
+              </w:rPr>
+              <w:t>xUnit and Moq isolate service behaviour; PostgreSQL integration tests use WebApplicationFactory and Testcontainers. Vitest with React Testing Library runs the web tests; flutter_test runs provider and widget tests with mocked dependencies. Commands and environment requirements are listed in Sections 2.3 and 12.</w:t>
             </w:r>
           </w:p>
         </w:tc>
@@ -42923,11 +42103,11 @@
                 <w:rFonts w:ascii="Arial" w:cs="Arial" w:eastAsia="Arial" w:hAnsi="Arial"/>
                 <w:b/>
                 <w:bCs/>
-                <w:color w:val="C00000"/>
-                <w:sz w:val="17"/>
-                <w:szCs w:val="17"/>
-              </w:rPr>
-              <w:t xml:space="preserve">[ADD: e.g. “cd mobile &amp;&amp; flutter test test/screens/… on 8 Oct 2026 — N passed”. Only what you ran yourself.]</w:t>
+                <w:color w:val="000000"/>
+                <w:sz w:val="17"/>
+                <w:szCs w:val="17"/>
+              </w:rPr>
+              <w:t>________________________________________________</w:t>
             </w:r>
           </w:p>
         </w:tc>
@@ -42993,11 +42173,11 @@
                 <w:rFonts w:ascii="Arial" w:cs="Arial" w:eastAsia="Arial" w:hAnsi="Arial"/>
                 <w:b/>
                 <w:bCs/>
-                <w:color w:val="C00000"/>
-                <w:sz w:val="17"/>
-                <w:szCs w:val="17"/>
-              </w:rPr>
-              <w:t xml:space="preserve">[ADD: defect ID, what you did, commit or PR number.]</w:t>
+                <w:color w:val="000000"/>
+                <w:sz w:val="17"/>
+                <w:szCs w:val="17"/>
+              </w:rPr>
+              <w:t>________________________________________________</w:t>
             </w:r>
           </w:p>
         </w:tc>
@@ -43063,11 +42243,11 @@
                 <w:rFonts w:ascii="Arial" w:cs="Arial" w:eastAsia="Arial" w:hAnsi="Arial"/>
                 <w:b/>
                 <w:bCs/>
-                <w:color w:val="C00000"/>
-                <w:sz w:val="17"/>
-                <w:szCs w:val="17"/>
-              </w:rPr>
-              <w:t xml:space="preserve">[ADD: test file and method; what you would change to add one more boundary or failure case.]</w:t>
+                <w:color w:val="000000"/>
+                <w:sz w:val="17"/>
+                <w:szCs w:val="17"/>
+              </w:rPr>
+              <w:t>________________________________________________</w:t>
             </w:r>
           </w:p>
         </w:tc>
@@ -43101,10 +42281,11 @@
                 <w:rFonts w:ascii="Arial" w:cs="Arial" w:eastAsia="Arial" w:hAnsi="Arial"/>
                 <w:b w:val="false"/>
                 <w:bCs w:val="false"/>
-                <w:sz w:val="17"/>
-                <w:szCs w:val="17"/>
-              </w:rPr>
-              <w:t xml:space="preserve">Why this tool and how it is configured</w:t>
+                <w:color w:val="000000"/>
+                <w:sz w:val="17"/>
+                <w:szCs w:val="17"/>
+              </w:rPr>
+              <w:t>Tool justification and configuration</w:t>
             </w:r>
           </w:p>
         </w:tc>
@@ -43133,11 +42314,11 @@
                 <w:rFonts w:ascii="Arial" w:cs="Arial" w:eastAsia="Arial" w:hAnsi="Arial"/>
                 <w:b/>
                 <w:bCs/>
-                <w:color w:val="C00000"/>
-                <w:sz w:val="17"/>
-                <w:szCs w:val="17"/>
-              </w:rPr>
-              <w:t xml:space="preserve">[ADD: 2–3 sentences in your own words.]</w:t>
+                <w:color w:val="000000"/>
+                <w:sz w:val="17"/>
+                <w:szCs w:val="17"/>
+              </w:rPr>
+              <w:t>xUnit and Moq isolate service behaviour; PostgreSQL integration tests use WebApplicationFactory and Testcontainers. Vitest with React Testing Library runs the web tests; flutter_test runs provider and widget tests with mocked dependencies. Commands and environment requirements are listed in Sections 2.3 and 12.</w:t>
             </w:r>
           </w:p>
         </w:tc>
@@ -43304,7 +42485,7 @@
                 <w:sz w:val="17"/>
                 <w:szCs w:val="17"/>
               </w:rPr>
-              <w:t xml:space="preserve">How the group checked it</w:t>
+              <w:t>Recorded verification</w:t>
             </w:r>
           </w:p>
         </w:tc>
@@ -43402,11 +42583,11 @@
                 <w:rFonts w:ascii="Arial" w:cs="Arial" w:eastAsia="Arial" w:hAnsi="Arial"/>
                 <w:b/>
                 <w:bCs/>
-                <w:color w:val="C00000"/>
-                <w:sz w:val="17"/>
-                <w:szCs w:val="17"/>
-              </w:rPr>
-              <w:t xml:space="preserve">[ADD: how you verified them against the real system, e.g. ran each test, read the assertions, removed unsupported claims]</w:t>
+                <w:color w:val="000000"/>
+                <w:sz w:val="17"/>
+                <w:szCs w:val="17"/>
+              </w:rPr>
+              <w:t>Named cases were matched to executable tests and their assertions. Retained TRX and suite logs establish execution; connected client observations and live API assertions check behaviours missed by component mocks. Unsupported prompt-injection claims are excluded (Section 7).</w:t>
             </w:r>
           </w:p>
         </w:tc>
@@ -43504,11 +42685,11 @@
                 <w:rFonts w:ascii="Arial" w:cs="Arial" w:eastAsia="Arial" w:hAnsi="Arial"/>
                 <w:b/>
                 <w:bCs/>
-                <w:color w:val="C00000"/>
-                <w:sz w:val="17"/>
-                <w:szCs w:val="17"/>
-              </w:rPr>
-              <w:t xml:space="preserve">[ADD: who supervised the runs and re-ran which commands personally]</w:t>
+                <w:color w:val="000000"/>
+                <w:sz w:val="17"/>
+                <w:szCs w:val="17"/>
+              </w:rPr>
+              <w:t>Commands, runtime versions, revision references, logs and screenshots are retained. Fresh current-revision unit and Flutter runs passed (logs 09–11); human supervisor and personally repeated commands: ____________________.</w:t>
             </w:r>
           </w:p>
         </w:tc>
@@ -43606,11 +42787,11 @@
                 <w:rFonts w:ascii="Arial" w:cs="Arial" w:eastAsia="Arial" w:hAnsi="Arial"/>
                 <w:b/>
                 <w:bCs/>
-                <w:color w:val="C00000"/>
-                <w:sz w:val="17"/>
-                <w:szCs w:val="17"/>
-              </w:rPr>
-              <w:t xml:space="preserve">[ADD: who reviewed and merged, and what you checked]</w:t>
+                <w:color w:val="000000"/>
+                <w:sz w:val="17"/>
+                <w:szCs w:val="17"/>
+              </w:rPr>
+              <w:t>Retained before-fix regression tests fail; after-fix integration, React and Flutter tests pass. Patient-response JSON and screenshots corroborate the privacy and delay fixes. Git records merges under ImSahanS. Independent human reviewer: ____________________.</w:t>
             </w:r>
           </w:p>
         </w:tc>
@@ -43708,11 +42889,11 @@
                 <w:rFonts w:ascii="Arial" w:cs="Arial" w:eastAsia="Arial" w:hAnsi="Arial"/>
                 <w:b/>
                 <w:bCs/>
-                <w:color w:val="C00000"/>
-                <w:sz w:val="17"/>
-                <w:szCs w:val="17"/>
-              </w:rPr>
-              <w:t xml:space="preserve">[ADD: who reviewed the final text against the evidence]</w:t>
+                <w:color w:val="000000"/>
+                <w:sz w:val="17"/>
+                <w:szCs w:val="17"/>
+              </w:rPr>
+              <w:t>Counts, coverage scope, commit ancestry and evidence paths were reconciled against retained logs and current source. API-only journeys and incomplete visual reruns are explicitly distinguished. Final human reviewer: ____________________.</w:t>
             </w:r>
           </w:p>
         </w:tc>
@@ -43732,11 +42913,19 @@
           <w:rFonts w:ascii="Arial" w:cs="Arial" w:eastAsia="Arial" w:hAnsi="Arial"/>
           <w:b/>
           <w:bCs/>
-          <w:color w:val="C00000"/>
+          <w:color w:val="000000"/>
           <w:sz w:val="20"/>
           <w:szCs w:val="20"/>
         </w:rPr>
-        <w:t xml:space="preserve">[ADD: each member’s individual CLEAR declaration, using the module’s CLEAR template and written in the member’s own words (S1, S2, S3, S4). State the tools used (for example Claude, Codex, ChatGPT), what for, and what you can explain and reproduce in the viva.]</w:t>
+        <w:t>Individual CLEAR declarations</w:t>
+        <w:br/>
+        <w:t>S1: ____________________________________________________________</w:t>
+        <w:br/>
+        <w:t>S2: ____________________________________________________________</w:t>
+        <w:br/>
+        <w:t>S3: ____________________________________________________________</w:t>
+        <w:br/>
+        <w:t>S4: ____________________________________________________________</w:t>
       </w:r>
     </w:p>
     <w:p>
@@ -43890,7 +43079,7 @@
           <w:sz w:val="20"/>
           <w:szCs w:val="20"/>
         </w:rPr>
-        <w:t xml:space="preserve">The system was tested at every level the specification lists: backend and API, database, React, Flutter, integration and end-to-end, performance, security and the agentic AI subsystem, each with a tool or framework. On 8 October 1,059 automated tests passed with none failing; 45 of 47 designed test cases pass and two are partial with the gap stated. Sixteen defects were recorded, fixed and retested, including two High privacy and workflow defects that only the connected-client run exposed. Performance testing showed zero failures across 14,000 requests and identified the database connection limit as the first bottleneck; security scanning with three roles found no High or Medium alert. The central safety property — no AI-generated guidance reaches a patient without a doctor’s approval — held in every test, including the hosted-model runs and the safe-failure case.</w:t>
+        <w:t>The system was tested at every level the specification lists: backend and API, database, React, Flutter, integration and end-to-end, performance, security and the agentic AI subsystem, each with a tool or framework. On 8 October 1,063 automated tests passed with none failing; 45 of 47 designed test cases pass and two are partial with the gap stated. Sixteen defects were recorded, fixed and retested, including two High privacy and workflow defects that only the connected-client run exposed. Performance testing showed zero failures across 14,000 requests and identified the database connection limit as the first bottleneck; security scanning with three roles found no High or Medium alert. The central safety property — no AI-generated guidance reaches a patient without a doctor’s approval — held in every test, including the hosted-model runs and the safe-failure case.</w:t>
       </w:r>
     </w:p>
     <w:p>
@@ -43914,7 +43103,7 @@
           <w:sz w:val="20"/>
           <w:szCs w:val="20"/>
         </w:rPr>
-        <w:t xml:space="preserve">All evidence is in the repository under docs/QMSE/evidence/ and is submitted with this report. </w:t>
+        <w:t>All evidence is in the repository under docs/QMSE/evidence/ and is submitted with this report as SE3090_SE016_Testing_Evidence.zip, a copy of that folder.</w:t>
       </w:r>
       <w:r>
         <w:rPr>
@@ -43922,7 +43111,6 @@
           <w:sz w:val="20"/>
           <w:szCs w:val="20"/>
         </w:rPr>
-        <w:t xml:space="preserve">All evidence is in the repository under docs/QMSE/evidence/ and is submitted with this report as SE3090_SE016_Testing_Evidence.zip, a copy of that folder.</w:t>
       </w:r>
     </w:p>
     <w:tbl>
@@ -44282,10 +43470,11 @@
                 <w:rFonts w:ascii="Arial" w:cs="Arial" w:eastAsia="Arial" w:hAnsi="Arial"/>
                 <w:b w:val="false"/>
                 <w:bCs w:val="false"/>
-                <w:sz w:val="17"/>
-                <w:szCs w:val="17"/>
-              </w:rPr>
-              <w:t xml:space="preserve">2026-10-08-zap/, 2026-10-08-zap-doctor/, 2026-10-08-zap-admin/ (HTML, JSON, Markdown reports, scan output, REPRODUCE.md); 2026-10-05/zap-first-run/ and zap-retest/</w:t>
+                <w:color w:val="000000"/>
+                <w:sz w:val="17"/>
+                <w:szCs w:val="17"/>
+              </w:rPr>
+              <w:t>2026-10-08-zap/, 2026-10-08-zap-doctor/, 2026-10-08-zap-admin/ (HTML, JSON, Markdown and scan output); rerun instructions in 2026-10-08-zap/REPRODUCE.md; earlier scans in 2026-10-05/zap-first-run/ and zap-retest/</w:t>
             </w:r>
           </w:p>
         </w:tc>
@@ -44489,10 +43678,11 @@
                 <w:rFonts w:ascii="Arial" w:cs="Arial" w:eastAsia="Arial" w:hAnsi="Arial"/>
                 <w:b w:val="false"/>
                 <w:bCs w:val="false"/>
-                <w:sz w:val="17"/>
-                <w:szCs w:val="17"/>
-              </w:rPr>
-              <w:t xml:space="preserve">2026-10-08-defect-retest/ (01 to 08); 2026-10-05/ (web-tests, web-tests-retest, web-lint-build, web-lint-build-retest)</w:t>
+                <w:color w:val="000000"/>
+                <w:sz w:val="17"/>
+                <w:szCs w:val="17"/>
+              </w:rPr>
+              <w:t>2026-10-08-defect-retest/ (01–11, including current unit/Flutter verification); 2026-10-05/ (web-tests, web-tests-retest, web-lint-build, web-lint-build-retest)</w:t>
             </w:r>
           </w:p>
         </w:tc>

</xml_diff>